<commit_message>
Documento final: reencuadre al nivel de complejidad real y mapeo de los 6 puntos
La plantilla original (Avance_Detallado_Examen_Parcial_Carwash_Opcion1.pdf)
define la Opción 1 como "Enfoque Ligero API" y cierra exigiendo 6 puntos
evaluativos, con el requisito de que al menos las 3 funciones de IA consuman la
API externa y reflejen los datos en la interfaz. El documento final heredaba
ese encuadre y presentaba el proyecto como si fuera solo eso, vendiéndolo por
debajo de lo que realmente hace.

- Portada: se retira "Opción 1 — Enfoque Ligero" y se declara el nivel real
  (modelos locales, recuperación semántica y analítica predictiva).
- Nuevo recuadro de complejidad con los cuatro frentes en que se supera el
  mínimo: modelo de visión local, pgvector, modelos predictivos propios y
  gobierno de IA.
- Nueva sección 9 con la tabla de los 6 puntos evaluativos y su evidencia
  verificable, más un contraste dimensión a dimensión contra el mínimo exigido.
- Conclusiones renumeradas a 10.
</commit_message>
<xml_diff>
--- a/docs/Documento_Final_Examen_Parcial_VivaModa.docx
+++ b/docs/Documento_Final_Examen_Parcial_VivaModa.docx
@@ -29,7 +29,9 @@
           <w:color w:val="4B41E1"/>
           <w:sz w:val="26"/>
         </w:rPr>
-        <w:t>Sistema Web VivaModa con Integración de IA (Opción 1 — Enfoque Ligero por API Externa)</w:t>
+        <w:t>Sistema Web VivaModa con Integración de IA — Nivel Avanzado</w:t>
+        <w:br/>
+        <w:t>Modelos locales, recuperación semántica y analítica predictiva sobre el mínimo exigido</w:t>
       </w:r>
     </w:p>
     <w:p>
@@ -60,7 +62,7 @@
           <w:color w:val="5C3F45"/>
           <w:sz w:val="20"/>
         </w:rPr>
-        <w:t>Arquitectura: Node.js + Express + PostgreSQL/pgvector + FashionCLIP + XGBoost + LLM API</w:t>
+        <w:t>Arquitectura: Node.js + Express + PostgreSQL/pgvector + FashionCLIP (local) + XGBoost + LLM API</w:t>
         <w:tab/>
         <w:tab/>
         <w:t>Semestre Académico 2026-II</w:t>
@@ -79,6 +81,49 @@
         </w:rPr>
         <w:t>Módulos de IA: 1) Chatbot Aria  2) Asesor Visual y RAG  3) Ayudante de Administración  4) Previsión de Demanda e Inventario</w:t>
       </w:r>
+    </w:p>
+    <w:tbl>
+      <w:tblPr>
+        <w:tblStyle w:val="TableGrid"/>
+        <w:tblW w:type="auto" w:w="0"/>
+        <w:tblLook w:firstColumn="1" w:firstRow="1" w:lastColumn="0" w:lastRow="0" w:noHBand="0" w:noVBand="1" w:val="04A0"/>
+      </w:tblPr>
+      <w:tblGrid>
+        <w:gridCol w:w="9648"/>
+      </w:tblGrid>
+      <w:tr>
+        <w:tc>
+          <w:tcPr>
+            <w:tcW w:type="dxa" w:w="9648"/>
+            <w:shd w:val="clear" w:color="auto" w:fill="EDE7F6"/>
+          </w:tcPr>
+          <w:p>
+            <w:r/>
+            <w:r>
+              <w:rPr>
+                <w:b/>
+                <w:color w:val="B60055"/>
+                <w:sz w:val="21"/>
+              </w:rPr>
+              <w:t>NIVEL DE COMPLEJIDAD ALCANZADO</w:t>
+            </w:r>
+          </w:p>
+          <w:p>
+            <w:r>
+              <w:rPr>
+                <w:color w:val="1C1B1D"/>
+                <w:sz w:val="20"/>
+              </w:rPr>
+              <w:t>La plantilla de referencia define la Opción 1 como "Enfoque Ligero API", cuyo requisito evaluativo es que "al menos las 3 funciones de IA consuman la API externa desde el backend y reflejen los datos dinámicamente en la interfaz". VivaModa cumple ese mínimo y lo supera en cuatro frentes: (1) ejecuta un modelo de visión-lenguaje LOCAL (FashionCLIP, 150 M de parámetros) en lugar de depender solo de la API; (2) almacena y consulta vectores de 512 dimensiones en la propia base de datos relacional con pgvector; (3) entrena modelos predictivos propios (XGBoost de dos etapas, con SHAP para explicabilidad) en vez de limitarse a consumir un LLM; y (4) añade gobierno de IA: telemetría de coste y latencia por llamada, reglas de negocio editables sin desplegar y monitorización de drift. El detalle de esta comparación está en la sección 9.</w:t>
+            </w:r>
+          </w:p>
+        </w:tc>
+      </w:tr>
+    </w:tbl>
+    <w:p>
+      <w:pPr>
+        <w:spacing w:after="80"/>
+      </w:pPr>
     </w:p>
     <w:tbl>
       <w:tblPr>
@@ -3204,7 +3249,879 @@
         <w:pStyle w:val="Heading1"/>
       </w:pPr>
       <w:r>
-        <w:t>9. Conclusiones</w:t>
+        <w:t>9. Cumplimiento de los 6 Puntos Evaluativos</w:t>
+      </w:r>
+    </w:p>
+    <w:p>
+      <w:pPr>
+        <w:spacing w:after="120" w:before="0"/>
+      </w:pPr>
+      <w:r>
+        <w:rPr>
+          <w:b w:val="0"/>
+          <w:i w:val="0"/>
+          <w:color w:val="1C1B1D"/>
+          <w:sz w:val="22"/>
+        </w:rPr>
+        <w:t>La plantilla de referencia cierra con un requisito evaluativo: presentar la ejecución funcional de 6 puntos, demostrando que al menos las 3 funciones de IA consumen la API externa desde el backend y reflejan los datos dinámicamente en la interfaz. La tabla siguiente mapea cada punto con su evidencia verificable en este proyecto:</w:t>
+      </w:r>
+    </w:p>
+    <w:tbl>
+      <w:tblPr>
+        <w:tblStyle w:val="TableGrid"/>
+        <w:tblW w:type="auto" w:w="0"/>
+        <w:jc w:val="center"/>
+        <w:tblLook w:firstColumn="1" w:firstRow="1" w:lastColumn="0" w:lastRow="0" w:noHBand="0" w:noVBand="1" w:val="04A0"/>
+      </w:tblPr>
+      <w:tblGrid>
+        <w:gridCol w:w="2412"/>
+        <w:gridCol w:w="2412"/>
+        <w:gridCol w:w="2412"/>
+        <w:gridCol w:w="2412"/>
+      </w:tblGrid>
+      <w:tr>
+        <w:tc>
+          <w:tcPr>
+            <w:tcW w:type="dxa" w:w="504"/>
+            <w:shd w:val="clear" w:color="auto" w:fill="B60055"/>
+          </w:tcPr>
+          <w:p>
+            <w:r/>
+            <w:r>
+              <w:rPr>
+                <w:b/>
+                <w:color w:val="FFFFFF"/>
+                <w:sz w:val="20"/>
+              </w:rPr>
+              <w:t>#</w:t>
+            </w:r>
+          </w:p>
+        </w:tc>
+        <w:tc>
+          <w:tcPr>
+            <w:tcW w:type="dxa" w:w="2448"/>
+            <w:shd w:val="clear" w:color="auto" w:fill="B60055"/>
+          </w:tcPr>
+          <w:p>
+            <w:r/>
+            <w:r>
+              <w:rPr>
+                <w:b/>
+                <w:color w:val="FFFFFF"/>
+                <w:sz w:val="20"/>
+              </w:rPr>
+              <w:t>Punto evaluativo</w:t>
+            </w:r>
+          </w:p>
+        </w:tc>
+        <w:tc>
+          <w:tcPr>
+            <w:tcW w:type="dxa" w:w="5328"/>
+            <w:shd w:val="clear" w:color="auto" w:fill="B60055"/>
+          </w:tcPr>
+          <w:p>
+            <w:r/>
+            <w:r>
+              <w:rPr>
+                <w:b/>
+                <w:color w:val="FFFFFF"/>
+                <w:sz w:val="20"/>
+              </w:rPr>
+              <w:t>Evidencia en VivaModa</w:t>
+            </w:r>
+          </w:p>
+        </w:tc>
+        <w:tc>
+          <w:tcPr>
+            <w:tcW w:type="dxa" w:w="1080"/>
+            <w:shd w:val="clear" w:color="auto" w:fill="B60055"/>
+          </w:tcPr>
+          <w:p>
+            <w:r/>
+            <w:r>
+              <w:rPr>
+                <w:b/>
+                <w:color w:val="FFFFFF"/>
+                <w:sz w:val="20"/>
+              </w:rPr>
+              <w:t>Estado</w:t>
+            </w:r>
+          </w:p>
+        </w:tc>
+      </w:tr>
+      <w:tr>
+        <w:tc>
+          <w:tcPr>
+            <w:tcW w:type="dxa" w:w="504"/>
+          </w:tcPr>
+          <w:p>
+            <w:r/>
+            <w:r>
+              <w:rPr>
+                <w:rFonts w:ascii="Calibri" w:hAnsi="Calibri"/>
+                <w:sz w:val="19"/>
+              </w:rPr>
+              <w:t>1</w:t>
+            </w:r>
+          </w:p>
+        </w:tc>
+        <w:tc>
+          <w:tcPr>
+            <w:tcW w:type="dxa" w:w="2448"/>
+          </w:tcPr>
+          <w:p>
+            <w:r/>
+            <w:r>
+              <w:rPr>
+                <w:rFonts w:ascii="Calibri" w:hAnsi="Calibri"/>
+                <w:sz w:val="19"/>
+              </w:rPr>
+              <w:t>Definición del problema complejo</w:t>
+            </w:r>
+          </w:p>
+        </w:tc>
+        <w:tc>
+          <w:tcPr>
+            <w:tcW w:type="dxa" w:w="5328"/>
+          </w:tcPr>
+          <w:p>
+            <w:r/>
+            <w:r>
+              <w:rPr>
+                <w:rFonts w:ascii="Calibri" w:hAnsi="Calibri"/>
+                <w:sz w:val="19"/>
+              </w:rPr>
+              <w:t>Cuatro problemas identificados, incluidos dos que la plantilla no contempla: opacidad de la propia IA y demanda intermitente en moda.</w:t>
+            </w:r>
+          </w:p>
+        </w:tc>
+        <w:tc>
+          <w:tcPr>
+            <w:tcW w:type="dxa" w:w="1080"/>
+          </w:tcPr>
+          <w:p>
+            <w:r/>
+            <w:r>
+              <w:rPr>
+                <w:rFonts w:ascii="Calibri" w:hAnsi="Calibri"/>
+                <w:sz w:val="19"/>
+              </w:rPr>
+              <w:t>Cumple</w:t>
+            </w:r>
+          </w:p>
+        </w:tc>
+      </w:tr>
+      <w:tr>
+        <w:tc>
+          <w:tcPr>
+            <w:tcW w:type="dxa" w:w="504"/>
+            <w:shd w:val="clear" w:color="auto" w:fill="F6F2F5"/>
+          </w:tcPr>
+          <w:p>
+            <w:r/>
+            <w:r>
+              <w:rPr>
+                <w:rFonts w:ascii="Calibri" w:hAnsi="Calibri"/>
+                <w:sz w:val="19"/>
+              </w:rPr>
+              <w:t>2</w:t>
+            </w:r>
+          </w:p>
+        </w:tc>
+        <w:tc>
+          <w:tcPr>
+            <w:tcW w:type="dxa" w:w="2448"/>
+            <w:shd w:val="clear" w:color="auto" w:fill="F6F2F5"/>
+          </w:tcPr>
+          <w:p>
+            <w:r/>
+            <w:r>
+              <w:rPr>
+                <w:rFonts w:ascii="Calibri" w:hAnsi="Calibri"/>
+                <w:sz w:val="19"/>
+              </w:rPr>
+              <w:t>Definición del aplicativo web básico</w:t>
+            </w:r>
+          </w:p>
+        </w:tc>
+        <w:tc>
+          <w:tcPr>
+            <w:tcW w:type="dxa" w:w="5328"/>
+            <w:shd w:val="clear" w:color="auto" w:fill="F6F2F5"/>
+          </w:tcPr>
+          <w:p>
+            <w:r/>
+            <w:r>
+              <w:rPr>
+                <w:rFonts w:ascii="Calibri" w:hAnsi="Calibri"/>
+                <w:sz w:val="19"/>
+              </w:rPr>
+              <w:t>Aplicación web operativa con 12 vistas servidas por Node/Express, autenticación por roles (cliente, staff, admin) y sin paso de compilación.</w:t>
+            </w:r>
+          </w:p>
+        </w:tc>
+        <w:tc>
+          <w:tcPr>
+            <w:tcW w:type="dxa" w:w="1080"/>
+            <w:shd w:val="clear" w:color="auto" w:fill="F6F2F5"/>
+          </w:tcPr>
+          <w:p>
+            <w:r/>
+            <w:r>
+              <w:rPr>
+                <w:rFonts w:ascii="Calibri" w:hAnsi="Calibri"/>
+                <w:sz w:val="19"/>
+              </w:rPr>
+              <w:t>Cumple</w:t>
+            </w:r>
+          </w:p>
+        </w:tc>
+      </w:tr>
+      <w:tr>
+        <w:tc>
+          <w:tcPr>
+            <w:tcW w:type="dxa" w:w="504"/>
+          </w:tcPr>
+          <w:p>
+            <w:r/>
+            <w:r>
+              <w:rPr>
+                <w:rFonts w:ascii="Calibri" w:hAnsi="Calibri"/>
+                <w:sz w:val="19"/>
+              </w:rPr>
+              <w:t>3</w:t>
+            </w:r>
+          </w:p>
+        </w:tc>
+        <w:tc>
+          <w:tcPr>
+            <w:tcW w:type="dxa" w:w="2448"/>
+          </w:tcPr>
+          <w:p>
+            <w:r/>
+            <w:r>
+              <w:rPr>
+                <w:rFonts w:ascii="Calibri" w:hAnsi="Calibri"/>
+                <w:sz w:val="19"/>
+              </w:rPr>
+              <w:t>Caracterización de requerimientos funcionales con IA</w:t>
+            </w:r>
+          </w:p>
+        </w:tc>
+        <w:tc>
+          <w:tcPr>
+            <w:tcW w:type="dxa" w:w="5328"/>
+          </w:tcPr>
+          <w:p>
+            <w:r/>
+            <w:r>
+              <w:rPr>
+                <w:rFonts w:ascii="Calibri" w:hAnsi="Calibri"/>
+                <w:sz w:val="19"/>
+              </w:rPr>
+              <w:t>No 3, sino 4 módulos: chatbot Aria, asesor visual con RAG, ayudante de administración y previsión de demanda con optimización de inventario.</w:t>
+            </w:r>
+          </w:p>
+        </w:tc>
+        <w:tc>
+          <w:tcPr>
+            <w:tcW w:type="dxa" w:w="1080"/>
+          </w:tcPr>
+          <w:p>
+            <w:r/>
+            <w:r>
+              <w:rPr>
+                <w:rFonts w:ascii="Calibri" w:hAnsi="Calibri"/>
+                <w:sz w:val="19"/>
+              </w:rPr>
+              <w:t>Supera</w:t>
+            </w:r>
+          </w:p>
+        </w:tc>
+      </w:tr>
+      <w:tr>
+        <w:tc>
+          <w:tcPr>
+            <w:tcW w:type="dxa" w:w="504"/>
+            <w:shd w:val="clear" w:color="auto" w:fill="F6F2F5"/>
+          </w:tcPr>
+          <w:p>
+            <w:r/>
+            <w:r>
+              <w:rPr>
+                <w:rFonts w:ascii="Calibri" w:hAnsi="Calibri"/>
+                <w:sz w:val="19"/>
+              </w:rPr>
+              <w:t>4</w:t>
+            </w:r>
+          </w:p>
+        </w:tc>
+        <w:tc>
+          <w:tcPr>
+            <w:tcW w:type="dxa" w:w="2448"/>
+            <w:shd w:val="clear" w:color="auto" w:fill="F6F2F5"/>
+          </w:tcPr>
+          <w:p>
+            <w:r/>
+            <w:r>
+              <w:rPr>
+                <w:rFonts w:ascii="Calibri" w:hAnsi="Calibri"/>
+                <w:sz w:val="19"/>
+              </w:rPr>
+              <w:t>Diagrama de base de datos relacional</w:t>
+            </w:r>
+          </w:p>
+        </w:tc>
+        <w:tc>
+          <w:tcPr>
+            <w:tcW w:type="dxa" w:w="5328"/>
+            <w:shd w:val="clear" w:color="auto" w:fill="F6F2F5"/>
+          </w:tcPr>
+          <w:p>
+            <w:r/>
+            <w:r>
+              <w:rPr>
+                <w:rFonts w:ascii="Calibri" w:hAnsi="Calibri"/>
+                <w:sz w:val="19"/>
+              </w:rPr>
+              <w:t>Más de 25 tablas agrupadas en 7 dominios, con extensión vectorial pgvector y registro de features con control de fuga de información.</w:t>
+            </w:r>
+          </w:p>
+        </w:tc>
+        <w:tc>
+          <w:tcPr>
+            <w:tcW w:type="dxa" w:w="1080"/>
+            <w:shd w:val="clear" w:color="auto" w:fill="F6F2F5"/>
+          </w:tcPr>
+          <w:p>
+            <w:r/>
+            <w:r>
+              <w:rPr>
+                <w:rFonts w:ascii="Calibri" w:hAnsi="Calibri"/>
+                <w:sz w:val="19"/>
+              </w:rPr>
+              <w:t>Supera</w:t>
+            </w:r>
+          </w:p>
+        </w:tc>
+      </w:tr>
+      <w:tr>
+        <w:tc>
+          <w:tcPr>
+            <w:tcW w:type="dxa" w:w="504"/>
+          </w:tcPr>
+          <w:p>
+            <w:r/>
+            <w:r>
+              <w:rPr>
+                <w:rFonts w:ascii="Calibri" w:hAnsi="Calibri"/>
+                <w:sz w:val="19"/>
+              </w:rPr>
+              <w:t>5</w:t>
+            </w:r>
+          </w:p>
+        </w:tc>
+        <w:tc>
+          <w:tcPr>
+            <w:tcW w:type="dxa" w:w="2448"/>
+          </w:tcPr>
+          <w:p>
+            <w:r/>
+            <w:r>
+              <w:rPr>
+                <w:rFonts w:ascii="Calibri" w:hAnsi="Calibri"/>
+                <w:sz w:val="19"/>
+              </w:rPr>
+              <w:t>Procedimiento de integración (API externa)</w:t>
+            </w:r>
+          </w:p>
+        </w:tc>
+        <w:tc>
+          <w:tcPr>
+            <w:tcW w:type="dxa" w:w="5328"/>
+          </w:tcPr>
+          <w:p>
+            <w:r/>
+            <w:r>
+              <w:rPr>
+                <w:rFonts w:ascii="Calibri" w:hAnsi="Calibri"/>
+                <w:sz w:val="19"/>
+              </w:rPr>
+              <w:t>Cinco etapas implementadas, más un planificador híbrido que evita la llamada al LLM cuando la heurística local basta, y telemetría de consumo por llamada.</w:t>
+            </w:r>
+          </w:p>
+        </w:tc>
+        <w:tc>
+          <w:tcPr>
+            <w:tcW w:type="dxa" w:w="1080"/>
+          </w:tcPr>
+          <w:p>
+            <w:r/>
+            <w:r>
+              <w:rPr>
+                <w:rFonts w:ascii="Calibri" w:hAnsi="Calibri"/>
+                <w:sz w:val="19"/>
+              </w:rPr>
+              <w:t>Supera</w:t>
+            </w:r>
+          </w:p>
+        </w:tc>
+      </w:tr>
+      <w:tr>
+        <w:tc>
+          <w:tcPr>
+            <w:tcW w:type="dxa" w:w="504"/>
+            <w:shd w:val="clear" w:color="auto" w:fill="F6F2F5"/>
+          </w:tcPr>
+          <w:p>
+            <w:r/>
+            <w:r>
+              <w:rPr>
+                <w:rFonts w:ascii="Calibri" w:hAnsi="Calibri"/>
+                <w:sz w:val="19"/>
+              </w:rPr>
+              <w:t>6</w:t>
+            </w:r>
+          </w:p>
+        </w:tc>
+        <w:tc>
+          <w:tcPr>
+            <w:tcW w:type="dxa" w:w="2448"/>
+            <w:shd w:val="clear" w:color="auto" w:fill="F6F2F5"/>
+          </w:tcPr>
+          <w:p>
+            <w:r/>
+            <w:r>
+              <w:rPr>
+                <w:rFonts w:ascii="Calibri" w:hAnsi="Calibri"/>
+                <w:sz w:val="19"/>
+              </w:rPr>
+              <w:t>Funcionamiento arquitectónico (backend y frontend)</w:t>
+            </w:r>
+          </w:p>
+        </w:tc>
+        <w:tc>
+          <w:tcPr>
+            <w:tcW w:type="dxa" w:w="5328"/>
+            <w:shd w:val="clear" w:color="auto" w:fill="F6F2F5"/>
+          </w:tcPr>
+          <w:p>
+            <w:r/>
+            <w:r>
+              <w:rPr>
+                <w:rFonts w:ascii="Calibri" w:hAnsi="Calibri"/>
+                <w:sz w:val="19"/>
+              </w:rPr>
+              <w:t>Backend proxy con degradación elegante a motor local; frontend con consumo asíncrono, renderizado dinámico y streaming por SSE.</w:t>
+            </w:r>
+          </w:p>
+        </w:tc>
+        <w:tc>
+          <w:tcPr>
+            <w:tcW w:type="dxa" w:w="1080"/>
+            <w:shd w:val="clear" w:color="auto" w:fill="F6F2F5"/>
+          </w:tcPr>
+          <w:p>
+            <w:r/>
+            <w:r>
+              <w:rPr>
+                <w:rFonts w:ascii="Calibri" w:hAnsi="Calibri"/>
+                <w:sz w:val="19"/>
+              </w:rPr>
+              <w:t>Cumple</w:t>
+            </w:r>
+          </w:p>
+        </w:tc>
+      </w:tr>
+    </w:tbl>
+    <w:p>
+      <w:pPr>
+        <w:spacing w:after="80"/>
+      </w:pPr>
+    </w:p>
+    <w:p>
+      <w:pPr>
+        <w:pStyle w:val="Heading2"/>
+      </w:pPr>
+      <w:r>
+        <w:t>Contraste con el mínimo de la Opción 1</w:t>
+      </w:r>
+    </w:p>
+    <w:p>
+      <w:pPr>
+        <w:spacing w:after="120" w:before="0"/>
+      </w:pPr>
+      <w:r>
+        <w:rPr>
+          <w:b w:val="0"/>
+          <w:i w:val="0"/>
+          <w:color w:val="1C1B1D"/>
+          <w:sz w:val="22"/>
+        </w:rPr>
+        <w:t>El requisito mínimo exige que las funciones de IA consuman una API externa. VivaModa lo cumple, pero añade capacidades que la Opción 1 no contempla:</w:t>
+      </w:r>
+    </w:p>
+    <w:tbl>
+      <w:tblPr>
+        <w:tblStyle w:val="TableGrid"/>
+        <w:tblW w:type="auto" w:w="0"/>
+        <w:jc w:val="center"/>
+        <w:tblLook w:firstColumn="1" w:firstRow="1" w:lastColumn="0" w:lastRow="0" w:noHBand="0" w:noVBand="1" w:val="04A0"/>
+      </w:tblPr>
+      <w:tblGrid>
+        <w:gridCol w:w="3216"/>
+        <w:gridCol w:w="3216"/>
+        <w:gridCol w:w="3216"/>
+      </w:tblGrid>
+      <w:tr>
+        <w:tc>
+          <w:tcPr>
+            <w:tcW w:type="dxa" w:w="1944"/>
+            <w:shd w:val="clear" w:color="auto" w:fill="B60055"/>
+          </w:tcPr>
+          <w:p>
+            <w:r/>
+            <w:r>
+              <w:rPr>
+                <w:b/>
+                <w:color w:val="FFFFFF"/>
+                <w:sz w:val="20"/>
+              </w:rPr>
+              <w:t>Dimensión</w:t>
+            </w:r>
+          </w:p>
+        </w:tc>
+        <w:tc>
+          <w:tcPr>
+            <w:tcW w:type="dxa" w:w="2736"/>
+            <w:shd w:val="clear" w:color="auto" w:fill="B60055"/>
+          </w:tcPr>
+          <w:p>
+            <w:r/>
+            <w:r>
+              <w:rPr>
+                <w:b/>
+                <w:color w:val="FFFFFF"/>
+                <w:sz w:val="20"/>
+              </w:rPr>
+              <w:t>Mínimo exigido (Opción 1)</w:t>
+            </w:r>
+          </w:p>
+        </w:tc>
+        <w:tc>
+          <w:tcPr>
+            <w:tcW w:type="dxa" w:w="4680"/>
+            <w:shd w:val="clear" w:color="auto" w:fill="B60055"/>
+          </w:tcPr>
+          <w:p>
+            <w:r/>
+            <w:r>
+              <w:rPr>
+                <w:b/>
+                <w:color w:val="FFFFFF"/>
+                <w:sz w:val="20"/>
+              </w:rPr>
+              <w:t>Implementado en VivaModa</w:t>
+            </w:r>
+          </w:p>
+        </w:tc>
+      </w:tr>
+      <w:tr>
+        <w:tc>
+          <w:tcPr>
+            <w:tcW w:type="dxa" w:w="1944"/>
+          </w:tcPr>
+          <w:p>
+            <w:r/>
+            <w:r>
+              <w:rPr>
+                <w:rFonts w:ascii="Calibri" w:hAnsi="Calibri"/>
+                <w:sz w:val="19"/>
+              </w:rPr>
+              <w:t>Modelo de IA</w:t>
+            </w:r>
+          </w:p>
+        </w:tc>
+        <w:tc>
+          <w:tcPr>
+            <w:tcW w:type="dxa" w:w="2736"/>
+          </w:tcPr>
+          <w:p>
+            <w:r/>
+            <w:r>
+              <w:rPr>
+                <w:rFonts w:ascii="Calibri" w:hAnsi="Calibri"/>
+                <w:sz w:val="19"/>
+              </w:rPr>
+              <w:t>API externa consumida por HTTP</w:t>
+            </w:r>
+          </w:p>
+        </w:tc>
+        <w:tc>
+          <w:tcPr>
+            <w:tcW w:type="dxa" w:w="4680"/>
+          </w:tcPr>
+          <w:p>
+            <w:r/>
+            <w:r>
+              <w:rPr>
+                <w:rFonts w:ascii="Calibri" w:hAnsi="Calibri"/>
+                <w:sz w:val="19"/>
+              </w:rPr>
+              <w:t>API externa (DeepSeek) + modelo local FashionCLIP de 150 M de parámetros ejecutándose en el servidor, sin coste por consulta</w:t>
+            </w:r>
+          </w:p>
+        </w:tc>
+      </w:tr>
+      <w:tr>
+        <w:tc>
+          <w:tcPr>
+            <w:tcW w:type="dxa" w:w="1944"/>
+            <w:shd w:val="clear" w:color="auto" w:fill="F6F2F5"/>
+          </w:tcPr>
+          <w:p>
+            <w:r/>
+            <w:r>
+              <w:rPr>
+                <w:rFonts w:ascii="Calibri" w:hAnsi="Calibri"/>
+                <w:sz w:val="19"/>
+              </w:rPr>
+              <w:t>Recuperación de información</w:t>
+            </w:r>
+          </w:p>
+        </w:tc>
+        <w:tc>
+          <w:tcPr>
+            <w:tcW w:type="dxa" w:w="2736"/>
+            <w:shd w:val="clear" w:color="auto" w:fill="F6F2F5"/>
+          </w:tcPr>
+          <w:p>
+            <w:r/>
+            <w:r>
+              <w:rPr>
+                <w:rFonts w:ascii="Calibri" w:hAnsi="Calibri"/>
+                <w:sz w:val="19"/>
+              </w:rPr>
+              <w:t>Catálogo inyectado completo en el prompt</w:t>
+            </w:r>
+          </w:p>
+        </w:tc>
+        <w:tc>
+          <w:tcPr>
+            <w:tcW w:type="dxa" w:w="4680"/>
+            <w:shd w:val="clear" w:color="auto" w:fill="F6F2F5"/>
+          </w:tcPr>
+          <w:p>
+            <w:r/>
+            <w:r>
+              <w:rPr>
+                <w:rFonts w:ascii="Calibri" w:hAnsi="Calibri"/>
+                <w:sz w:val="19"/>
+              </w:rPr>
+              <w:t>Búsqueda vectorial sobre pgvector con embeddings de 512 dimensiones, re-ranking por atributos y verificación de grounding posterior</w:t>
+            </w:r>
+          </w:p>
+        </w:tc>
+      </w:tr>
+      <w:tr>
+        <w:tc>
+          <w:tcPr>
+            <w:tcW w:type="dxa" w:w="1944"/>
+          </w:tcPr>
+          <w:p>
+            <w:r/>
+            <w:r>
+              <w:rPr>
+                <w:rFonts w:ascii="Calibri" w:hAnsi="Calibri"/>
+                <w:sz w:val="19"/>
+              </w:rPr>
+              <w:t>Analítica</w:t>
+            </w:r>
+          </w:p>
+        </w:tc>
+        <w:tc>
+          <w:tcPr>
+            <w:tcW w:type="dxa" w:w="2736"/>
+          </w:tcPr>
+          <w:p>
+            <w:r/>
+            <w:r>
+              <w:rPr>
+                <w:rFonts w:ascii="Calibri" w:hAnsi="Calibri"/>
+                <w:sz w:val="19"/>
+              </w:rPr>
+              <w:t>No contemplada</w:t>
+            </w:r>
+          </w:p>
+        </w:tc>
+        <w:tc>
+          <w:tcPr>
+            <w:tcW w:type="dxa" w:w="4680"/>
+          </w:tcPr>
+          <w:p>
+            <w:r/>
+            <w:r>
+              <w:rPr>
+                <w:rFonts w:ascii="Calibri" w:hAnsi="Calibri"/>
+                <w:sz w:val="19"/>
+              </w:rPr>
+              <w:t>Modelo predictivo propio (XGBoost de dos etapas para demanda intermitente) con explicabilidad SHAP y auditoría de variables</w:t>
+            </w:r>
+          </w:p>
+        </w:tc>
+      </w:tr>
+      <w:tr>
+        <w:tc>
+          <w:tcPr>
+            <w:tcW w:type="dxa" w:w="1944"/>
+            <w:shd w:val="clear" w:color="auto" w:fill="F6F2F5"/>
+          </w:tcPr>
+          <w:p>
+            <w:r/>
+            <w:r>
+              <w:rPr>
+                <w:rFonts w:ascii="Calibri" w:hAnsi="Calibri"/>
+                <w:sz w:val="19"/>
+              </w:rPr>
+              <w:t>Gobierno de IA</w:t>
+            </w:r>
+          </w:p>
+        </w:tc>
+        <w:tc>
+          <w:tcPr>
+            <w:tcW w:type="dxa" w:w="2736"/>
+            <w:shd w:val="clear" w:color="auto" w:fill="F6F2F5"/>
+          </w:tcPr>
+          <w:p>
+            <w:r/>
+            <w:r>
+              <w:rPr>
+                <w:rFonts w:ascii="Calibri" w:hAnsi="Calibri"/>
+                <w:sz w:val="19"/>
+              </w:rPr>
+              <w:t>No contemplado</w:t>
+            </w:r>
+          </w:p>
+        </w:tc>
+        <w:tc>
+          <w:tcPr>
+            <w:tcW w:type="dxa" w:w="4680"/>
+            <w:shd w:val="clear" w:color="auto" w:fill="F6F2F5"/>
+          </w:tcPr>
+          <w:p>
+            <w:r/>
+            <w:r>
+              <w:rPr>
+                <w:rFonts w:ascii="Calibri" w:hAnsi="Calibri"/>
+                <w:sz w:val="19"/>
+              </w:rPr>
+              <w:t>Telemetría por llamada (tokens, caché, coste, latencia, error), reglas de negocio editables sin desplegar y monitorización de drift por PSI</w:t>
+            </w:r>
+          </w:p>
+        </w:tc>
+      </w:tr>
+      <w:tr>
+        <w:tc>
+          <w:tcPr>
+            <w:tcW w:type="dxa" w:w="1944"/>
+          </w:tcPr>
+          <w:p>
+            <w:r/>
+            <w:r>
+              <w:rPr>
+                <w:rFonts w:ascii="Calibri" w:hAnsi="Calibri"/>
+                <w:sz w:val="19"/>
+              </w:rPr>
+              <w:t>Persistencia del conocimiento</w:t>
+            </w:r>
+          </w:p>
+        </w:tc>
+        <w:tc>
+          <w:tcPr>
+            <w:tcW w:type="dxa" w:w="2736"/>
+          </w:tcPr>
+          <w:p>
+            <w:r/>
+            <w:r>
+              <w:rPr>
+                <w:rFonts w:ascii="Calibri" w:hAnsi="Calibri"/>
+                <w:sz w:val="19"/>
+              </w:rPr>
+              <w:t>Columna ia_log con el JSON de respuesta</w:t>
+            </w:r>
+          </w:p>
+        </w:tc>
+        <w:tc>
+          <w:tcPr>
+            <w:tcW w:type="dxa" w:w="4680"/>
+          </w:tcPr>
+          <w:p>
+            <w:r/>
+            <w:r>
+              <w:rPr>
+                <w:rFonts w:ascii="Calibri" w:hAnsi="Calibri"/>
+                <w:sz w:val="19"/>
+              </w:rPr>
+              <w:t>Seis tablas dedicadas: trazas, memoria del cliente, telemetría, configuración, conocimiento y registro de experimentos</w:t>
+            </w:r>
+          </w:p>
+        </w:tc>
+      </w:tr>
+    </w:tbl>
+    <w:p>
+      <w:pPr>
+        <w:spacing w:after="80"/>
+      </w:pPr>
+    </w:p>
+    <w:tbl>
+      <w:tblPr>
+        <w:tblStyle w:val="TableGrid"/>
+        <w:tblW w:type="auto" w:w="0"/>
+        <w:tblLook w:firstColumn="1" w:firstRow="1" w:lastColumn="0" w:lastRow="0" w:noHBand="0" w:noVBand="1" w:val="04A0"/>
+      </w:tblPr>
+      <w:tblGrid>
+        <w:gridCol w:w="9648"/>
+      </w:tblGrid>
+      <w:tr>
+        <w:tc>
+          <w:tcPr>
+            <w:tcW w:type="dxa" w:w="9648"/>
+            <w:shd w:val="clear" w:color="auto" w:fill="E8F5E9"/>
+          </w:tcPr>
+          <w:p>
+            <w:r/>
+            <w:r>
+              <w:rPr>
+                <w:b/>
+                <w:color w:val="B60055"/>
+                <w:sz w:val="21"/>
+              </w:rPr>
+              <w:t>Resultado del contraste</w:t>
+            </w:r>
+          </w:p>
+          <w:p>
+            <w:r>
+              <w:rPr>
+                <w:color w:val="1C1B1D"/>
+                <w:sz w:val="20"/>
+              </w:rPr>
+              <w:t>El proyecto satisface los 6 puntos evaluativos y supera el mínimo en los puntos 3, 4 y 5, además de cubrir dos dimensiones —analítica predictiva y gobierno de IA— que la Opción 1 ni plantea. Las métricas de validación de cada módulo están en la sección 8.</w:t>
+            </w:r>
+          </w:p>
+        </w:tc>
+      </w:tr>
+    </w:tbl>
+    <w:p>
+      <w:pPr>
+        <w:spacing w:after="80"/>
+      </w:pPr>
+    </w:p>
+    <w:p>
+      <w:pPr>
+        <w:pStyle w:val="Heading1"/>
+      </w:pPr>
+      <w:r>
+        <w:t>10. Conclusiones</w:t>
       </w:r>
     </w:p>
     <w:p>

</xml_diff>